<commit_message>
Submission doc: point repository and demo links at RyanGupta16/ECHO; regenerate PDF
Co-Authored-By: Claude Opus 5.5 <noreply@anthropic.com>
Claude-Session: https://claude.ai/code/session_014Pcc2wm5itJpkE4dwMfcyM
</commit_message>
<xml_diff>
--- a/docs/submission/RyanGupta_230953288_FGAI_Assignment2.docx
+++ b/docs/submission/RyanGupta_230953288_FGAI_Assignment2.docx
@@ -408,7 +408,7 @@
               </w:rPr>
               <w:t xml:space="preserve">TinyStories (Eldan &amp; Li, 2023) — </w:t>
             </w:r>
-            <w:hyperlink w:history="1" r:id="rId2s2blmm2mf2kitep5fkez">
+            <w:hyperlink w:history="1" r:id="rIdoxju35782vxomenuckglo">
               <w:r>
                 <w:rPr>
                   <w:rStyle w:val="Hyperlink"/>
@@ -467,12 +467,12 @@
             </w:tcMar>
           </w:tcPr>
           <w:p>
-            <w:hyperlink w:history="1" r:id="rId1snyzqhyrdg_9mlr4o9oh">
+            <w:hyperlink w:history="1" r:id="rIdv6kjcl52twceyzwh8nytt">
               <w:r>
                 <w:rPr>
                   <w:rStyle w:val="Hyperlink"/>
                 </w:rPr>
-                <w:t xml:space="preserve">https://github.com/RyanGupta16/echo-recurrent-text-lab</w:t>
+                <w:t xml:space="preserve">https://github.com/RyanGupta16/ECHO</w:t>
               </w:r>
             </w:hyperlink>
           </w:p>
@@ -526,12 +526,12 @@
             </w:tcMar>
           </w:tcPr>
           <w:p>
-            <w:hyperlink w:history="1" r:id="rIdztelikugb-jzmv6rultih">
+            <w:hyperlink w:history="1" r:id="rIdsbwdert4lbb7pnmrohpjg">
               <w:r>
                 <w:rPr>
                   <w:rStyle w:val="Hyperlink"/>
                 </w:rPr>
-                <w:t xml:space="preserve">https://ryangupta16.github.io/echo-recurrent-text-lab/</w:t>
+                <w:t xml:space="preserve">https://ryangupta16.github.io/ECHO/</w:t>
               </w:r>
             </w:hyperlink>
           </w:p>

</xml_diff>